<commit_message>
Fix circular-logic wording in key finding, add tiered DSR decision layer, fix Auto-Pay per-provider wording (BR-04/BR-07, R-04/R-05)
</commit_message>
<xml_diff>
--- a/01_BRD/BNPL_Command_Center_BRD.docx
+++ b/01_BRD/BNPL_Command_Center_BRD.docx
@@ -2665,7 +2665,7 @@
                 <w:sz w:val="18"/>
                 <w:szCs w:val="18"/>
               </w:rPr>
-              <w:t xml:space="preserve">The system shall support a single automatic deduction from the customer's account that is distributed to each BNPL provider on time.</w:t>
+              <w:t>The system shall automatically deduct payment from the customer's account for each BNPL provider individually, on that provider's own due date, so every provider is paid on time -- the system does not consolidate multiple providers' payments into a single transfer (to avoid holding customer funds/float, which would create money-transmission-style compliance scope beyond this system).</w:t>
             </w:r>
           </w:p>
         </w:tc>
@@ -3061,7 +3061,7 @@
                 <w:sz w:val="18"/>
                 <w:szCs w:val="18"/>
               </w:rPr>
-              <w:t xml:space="preserve">The system shall never offer additional credit to a customer whose debt-service ratio exceeds an approved threshold; these customers shall instead be referred to existing BOT debt-relief programs.</w:t>
+              <w:t>The system shall apply a tiered Debt-Service Ratio (DSR) decision layer before any consolidation offer, not a single hard cutoff: (1) Full eligibility -- DSR &lt;= 40% and credit score &gt;= 600 -&gt; standard offer; (2) Conditional eligibility -- DSR 40-60% and credit score &gt;= 650 -&gt; a limited offer (lower amount / shorter term), not a straight decline; (3) Not eligible -- DSR &gt; 60%, or credit score &lt; 600 regardless of DSR -&gt; no additional credit is offered; these customers shall instead be referred to existing BOT debt-relief programs. See BR-04/BR-07 configurable thresholds and FRD R-04/R-05 for full logic.</w:t>
             </w:r>
           </w:p>
         </w:tc>
@@ -5088,7 +5088,7 @@
                 <w:sz w:val="18"/>
                 <w:szCs w:val="18"/>
               </w:rPr>
-              <w:t xml:space="preserve">Mandatory credit/income/DSR screening before any offer; hard rejection above DSR threshold</w:t>
+              <w:t>Mandatory credit/income/DSR screening before any offer, applied through the tiered DSR decision layer (BR-07); hard rejection for the Not Eligible tier (DSR &gt; 60% or credit score &lt; 600)</w:t>
             </w:r>
           </w:p>
         </w:tc>
@@ -6088,7 +6088,7 @@
                 <w:sz w:val="18"/>
                 <w:szCs w:val="18"/>
               </w:rPr>
-              <w:t xml:space="preserve">100% of applicants above the DSR threshold</w:t>
+              <w:t>100% of applicants in the Not Eligible DSR tier (BR-07) correctly rejected</w:t>
             </w:r>
           </w:p>
         </w:tc>

</xml_diff>